<commit_message>
test: replace sample.docx with Tika testWORD.docx (real heading hierarchy)
</commit_message>
<xml_diff>
--- a/tests/sample_docs/sample.docx
+++ b/tests/sample_docs/sample.docx
@@ -3,91 +3,752 @@
 <w:document xmlns:ve="http://schemas.openxmlformats.org/markup-compatibility/2006" xmlns:o="urn:schemas-microsoft-com:office:office" xmlns:r="http://schemas.openxmlformats.org/officeDocument/2006/relationships" xmlns:m="http://schemas.openxmlformats.org/officeDocument/2006/math" xmlns:v="urn:schemas-microsoft-com:vml" xmlns:wp="http://schemas.openxmlformats.org/drawingml/2006/wordprocessingDrawing" xmlns:w10="urn:schemas-microsoft-com:office:word" xmlns:w="http://schemas.openxmlformats.org/wordprocessingml/2006/main" xmlns:wne="http://schemas.microsoft.com/office/word/2006/wordml">
   <w:body>
     <w:p>
-      <w:r>
-        <w:t>I am a test document</w:t>
-      </w:r>
-    </w:p>
-    <w:p>
-      <w:r>
-        <w:t>This is page 1</w:t>
-      </w:r>
-    </w:p>
-    <w:p>
-      <w:r>
-        <w:t>I am Calibri (Body) in font size 11</w:t>
-      </w:r>
-    </w:p>
-    <w:p>
-      <w:r>
-        <w:br w:type="page"/>
-      </w:r>
-    </w:p>
-    <w:p>
-      <w:pPr>
+      <w:pPr>
+        <w:pStyle w:val="Title"/>
+      </w:pPr>
+      <w:r>
+        <w:t>Sample Word Document Title</w:t>
+      </w:r>
+    </w:p>
+    <w:p>
+      <w:pPr>
+        <w:pStyle w:val="Subtitle"/>
+      </w:pPr>
+      <w:r>
+        <w:t>And now for a subtitle</w:t>
+      </w:r>
+    </w:p>
+    <w:p>
+      <w:pPr>
+        <w:pStyle w:val="Heading"/>
+      </w:pPr>
+      <w:r>
+        <w:t>Main Heading</w:t>
+      </w:r>
+      <w:bookmarkStart w:id="0" w:name="OnMainHeading"/>
+      <w:bookmarkEnd w:id="0"/>
+    </w:p>
+    <w:p>
+      <w:pPr>
+        <w:pStyle w:val="Heading1"/>
+      </w:pPr>
+      <w:r>
+        <w:t>Heading Level 1</w:t>
+      </w:r>
+    </w:p>
+    <w:p>
+      <w:pPr>
+        <w:pStyle w:val="Heading2"/>
+      </w:pPr>
+      <w:r>
+        <w:t>Heading Level 2</w:t>
+      </w:r>
+    </w:p>
+    <w:p>
+      <w:pPr>
+        <w:pStyle w:val="Heading3"/>
+      </w:pPr>
+      <w:r>
+        <w:t>Heading Level 3</w:t>
+      </w:r>
+      <w:bookmarkStart w:id="1" w:name="OnLevel3"/>
+      <w:bookmarkEnd w:id="1"/>
+    </w:p>
+    <w:p>
+      <w:pPr>
+        <w:pStyle w:val="Default"/>
+      </w:pPr>
+    </w:p>
+    <w:p>
+      <w:pPr>
+        <w:pStyle w:val="Default"/>
+      </w:pPr>
+      <w:r>
+        <w:t>This is a sample Microsoft Word Document.</w:t>
+      </w:r>
+    </w:p>
+    <w:p>
+      <w:pPr>
+        <w:pStyle w:val="Default"/>
+      </w:pPr>
+    </w:p>
+    <w:p>
+      <w:pPr>
+        <w:pStyle w:val="Default"/>
+      </w:pPr>
+      <w:r>
+        <w:t xml:space="preserve">This document includes text that is </w:t>
+      </w:r>
+      <w:r>
         <w:rPr>
-          <w:rFonts w:ascii="Arial Black" w:hAnsi="Arial Black"/>
-          <w:color w:val="548DD4" w:themeColor="text2" w:themeTint="99"/>
-          <w:sz w:val="32"/>
-          <w:szCs w:val="32"/>
+          <w:b/>
+          <w:bCs/>
         </w:rPr>
-      </w:pPr>
+        <w:t>BOLD</w:t>
+      </w:r>
+      <w:r>
+        <w:t xml:space="preserve"> and </w:t>
+      </w:r>
       <w:r>
         <w:rPr>
-          <w:rFonts w:ascii="Arial Black" w:hAnsi="Arial Black"/>
-          <w:color w:val="548DD4" w:themeColor="text2" w:themeTint="99"/>
-          <w:sz w:val="32"/>
-          <w:szCs w:val="32"/>
+          <w:i/>
+          <w:iCs/>
         </w:rPr>
+        <w:t>ITALIC</w:t>
+      </w:r>
+      <w:r>
+        <w:t>.</w:t>
+      </w:r>
+    </w:p>
+    <w:p>
+      <w:pPr>
+        <w:pStyle w:val="Default"/>
+      </w:pPr>
+    </w:p>
+    <w:tbl>
+      <w:tblPr>
+        <w:tblW w:w="8640" w:type="dxa"/>
+        <w:tblInd w:w="45" w:type="dxa"/>
+        <w:tblBorders>
+          <w:top w:val="single" w:sz="2" w:space="0" w:color="000000"/>
+          <w:left w:val="single" w:sz="2" w:space="0" w:color="000000"/>
+          <w:bottom w:val="single" w:sz="2" w:space="0" w:color="000000"/>
+        </w:tblBorders>
+        <w:tblCellMar>
+          <w:left w:w="10" w:type="dxa"/>
+          <w:right w:w="10" w:type="dxa"/>
+        </w:tblCellMar>
+        <w:tblLook w:val="0000"/>
+      </w:tblPr>
+      <w:tblGrid>
+        <w:gridCol w:w="2348"/>
+        <w:gridCol w:w="6292"/>
+      </w:tblGrid>
+      <w:tr>
+        <w:tblPrEx>
+          <w:tblCellMar>
+            <w:top w:w="0" w:type="dxa"/>
+            <w:bottom w:w="0" w:type="dxa"/>
+          </w:tblCellMar>
+        </w:tblPrEx>
+        <w:tc>
+          <w:tcPr>
+            <w:tcW w:w="4320" w:type="dxa"/>
+            <w:tcBorders>
+              <w:top w:val="single" w:sz="2" w:space="0" w:color="000000"/>
+              <w:left w:val="single" w:sz="2" w:space="0" w:color="000000"/>
+              <w:bottom w:val="single" w:sz="2" w:space="0" w:color="000000"/>
+            </w:tcBorders>
+            <w:shd w:val="clear" w:color="auto" w:fill="auto"/>
+            <w:tcMar>
+              <w:top w:w="55" w:type="dxa"/>
+              <w:left w:w="55" w:type="dxa"/>
+              <w:bottom w:w="55" w:type="dxa"/>
+              <w:right w:w="55" w:type="dxa"/>
+            </w:tcMar>
+          </w:tcPr>
+          <w:p>
+            <w:pPr>
+              <w:pStyle w:val="TableContents"/>
+            </w:pPr>
+            <w:r>
+              <w:t>This is a table</w:t>
+            </w:r>
+          </w:p>
+        </w:tc>
+        <w:tc>
+          <w:tcPr>
+            <w:tcW w:w="8640" w:type="dxa"/>
+            <w:tcBorders>
+              <w:top w:val="single" w:sz="2" w:space="0" w:color="000000"/>
+              <w:left w:val="single" w:sz="2" w:space="0" w:color="000000"/>
+              <w:bottom w:val="single" w:sz="2" w:space="0" w:color="000000"/>
+              <w:right w:val="single" w:sz="2" w:space="0" w:color="000000"/>
+            </w:tcBorders>
+            <w:shd w:val="clear" w:color="auto" w:fill="auto"/>
+            <w:tcMar>
+              <w:top w:w="55" w:type="dxa"/>
+              <w:left w:w="55" w:type="dxa"/>
+              <w:bottom w:w="55" w:type="dxa"/>
+              <w:right w:w="55" w:type="dxa"/>
+            </w:tcMar>
+          </w:tcPr>
+          <w:p>
+            <w:pPr>
+              <w:pStyle w:val="TableContents"/>
+            </w:pPr>
+          </w:p>
+        </w:tc>
+      </w:tr>
+      <w:tr>
+        <w:tblPrEx>
+          <w:tblCellMar>
+            <w:top w:w="0" w:type="dxa"/>
+            <w:bottom w:w="0" w:type="dxa"/>
+          </w:tblCellMar>
+        </w:tblPrEx>
+        <w:tc>
+          <w:tcPr>
+            <w:tcW w:w="4320" w:type="dxa"/>
+            <w:tcBorders>
+              <w:left w:val="single" w:sz="2" w:space="0" w:color="000000"/>
+              <w:bottom w:val="single" w:sz="2" w:space="0" w:color="000000"/>
+            </w:tcBorders>
+            <w:shd w:val="clear" w:color="auto" w:fill="auto"/>
+            <w:tcMar>
+              <w:top w:w="55" w:type="dxa"/>
+              <w:left w:w="55" w:type="dxa"/>
+              <w:bottom w:w="55" w:type="dxa"/>
+              <w:right w:w="55" w:type="dxa"/>
+            </w:tcMar>
+          </w:tcPr>
+          <w:p>
+            <w:pPr>
+              <w:pStyle w:val="TableContents"/>
+            </w:pPr>
+          </w:p>
+        </w:tc>
+        <w:tc>
+          <w:tcPr>
+            <w:tcW w:w="8640" w:type="dxa"/>
+            <w:tcBorders>
+              <w:left w:val="single" w:sz="2" w:space="0" w:color="000000"/>
+              <w:bottom w:val="single" w:sz="2" w:space="0" w:color="000000"/>
+              <w:right w:val="single" w:sz="2" w:space="0" w:color="000000"/>
+            </w:tcBorders>
+            <w:shd w:val="clear" w:color="auto" w:fill="auto"/>
+            <w:tcMar>
+              <w:top w:w="55" w:type="dxa"/>
+              <w:left w:w="55" w:type="dxa"/>
+              <w:bottom w:w="55" w:type="dxa"/>
+              <w:right w:w="55" w:type="dxa"/>
+            </w:tcMar>
+          </w:tcPr>
+          <w:tbl>
+            <w:tblPr>
+              <w:tblW w:w="4210" w:type="dxa"/>
+              <w:tblBorders>
+                <w:top w:val="single" w:sz="2" w:space="0" w:color="000000"/>
+                <w:left w:val="single" w:sz="2" w:space="0" w:color="000000"/>
+                <w:bottom w:val="single" w:sz="2" w:space="0" w:color="000000"/>
+              </w:tblBorders>
+              <w:tblCellMar>
+                <w:left w:w="10" w:type="dxa"/>
+                <w:right w:w="10" w:type="dxa"/>
+              </w:tblCellMar>
+              <w:tblLook w:val="0000"/>
+            </w:tblPr>
+            <w:tblGrid>
+              <w:gridCol w:w="1524"/>
+              <w:gridCol w:w="2686"/>
+            </w:tblGrid>
+            <w:tr>
+              <w:tblPrEx>
+                <w:tblCellMar>
+                  <w:top w:w="0" w:type="dxa"/>
+                  <w:bottom w:w="0" w:type="dxa"/>
+                </w:tblCellMar>
+              </w:tblPrEx>
+              <w:tc>
+                <w:tcPr>
+                  <w:tcW w:w="2105" w:type="dxa"/>
+                  <w:tcBorders>
+                    <w:top w:val="single" w:sz="2" w:space="0" w:color="000000"/>
+                    <w:left w:val="single" w:sz="2" w:space="0" w:color="000000"/>
+                    <w:bottom w:val="single" w:sz="2" w:space="0" w:color="000000"/>
+                  </w:tcBorders>
+                  <w:shd w:val="clear" w:color="auto" w:fill="auto"/>
+                  <w:tcMar>
+                    <w:top w:w="55" w:type="dxa"/>
+                    <w:left w:w="55" w:type="dxa"/>
+                    <w:bottom w:w="55" w:type="dxa"/>
+                    <w:right w:w="55" w:type="dxa"/>
+                  </w:tcMar>
+                </w:tcPr>
+                <w:p>
+                  <w:pPr>
+                    <w:pStyle w:val="TableContents"/>
+                  </w:pPr>
+                  <w:r>
+                    <w:t>Nested table</w:t>
+                  </w:r>
+                </w:p>
+              </w:tc>
+              <w:tc>
+                <w:tcPr>
+                  <w:tcW w:w="4210" w:type="dxa"/>
+                  <w:tcBorders>
+                    <w:top w:val="single" w:sz="2" w:space="0" w:color="000000"/>
+                    <w:left w:val="single" w:sz="2" w:space="0" w:color="000000"/>
+                    <w:bottom w:val="single" w:sz="2" w:space="0" w:color="000000"/>
+                    <w:right w:val="single" w:sz="2" w:space="0" w:color="000000"/>
+                  </w:tcBorders>
+                  <w:shd w:val="clear" w:color="auto" w:fill="auto"/>
+                  <w:tcMar>
+                    <w:top w:w="55" w:type="dxa"/>
+                    <w:left w:w="55" w:type="dxa"/>
+                    <w:bottom w:w="55" w:type="dxa"/>
+                    <w:right w:w="55" w:type="dxa"/>
+                  </w:tcMar>
+                </w:tcPr>
+                <w:p>
+                  <w:pPr>
+                    <w:pStyle w:val="TableContents"/>
+                  </w:pPr>
+                </w:p>
+              </w:tc>
+            </w:tr>
+            <w:tr>
+              <w:tblPrEx>
+                <w:tblCellMar>
+                  <w:top w:w="0" w:type="dxa"/>
+                  <w:bottom w:w="0" w:type="dxa"/>
+                </w:tblCellMar>
+              </w:tblPrEx>
+              <w:tc>
+                <w:tcPr>
+                  <w:tcW w:w="2105" w:type="dxa"/>
+                  <w:tcBorders>
+                    <w:left w:val="single" w:sz="2" w:space="0" w:color="000000"/>
+                    <w:bottom w:val="single" w:sz="2" w:space="0" w:color="000000"/>
+                  </w:tcBorders>
+                  <w:shd w:val="clear" w:color="auto" w:fill="auto"/>
+                  <w:tcMar>
+                    <w:top w:w="55" w:type="dxa"/>
+                    <w:left w:w="55" w:type="dxa"/>
+                    <w:bottom w:w="55" w:type="dxa"/>
+                    <w:right w:w="55" w:type="dxa"/>
+                  </w:tcMar>
+                </w:tcPr>
+                <w:p>
+                  <w:pPr>
+                    <w:pStyle w:val="TableContents"/>
+                  </w:pPr>
+                </w:p>
+              </w:tc>
+              <w:tc>
+                <w:tcPr>
+                  <w:tcW w:w="4210" w:type="dxa"/>
+                  <w:tcBorders>
+                    <w:left w:val="single" w:sz="2" w:space="0" w:color="000000"/>
+                    <w:bottom w:val="single" w:sz="2" w:space="0" w:color="000000"/>
+                    <w:right w:val="single" w:sz="2" w:space="0" w:color="000000"/>
+                  </w:tcBorders>
+                  <w:shd w:val="clear" w:color="auto" w:fill="auto"/>
+                  <w:tcMar>
+                    <w:top w:w="55" w:type="dxa"/>
+                    <w:left w:w="55" w:type="dxa"/>
+                    <w:bottom w:w="55" w:type="dxa"/>
+                    <w:right w:w="55" w:type="dxa"/>
+                  </w:tcMar>
+                </w:tcPr>
+                <w:p>
+                  <w:pPr>
+                    <w:pStyle w:val="TableContents"/>
+                  </w:pPr>
+                  <w:r>
+                    <w:t>More of our</w:t>
+                  </w:r>
+                  <w:r>
+                    <w:t xml:space="preserve"> nested table</w:t>
+                  </w:r>
+                </w:p>
+              </w:tc>
+            </w:tr>
+          </w:tbl>
+          <w:p>
+            <w:pPr>
+              <w:pStyle w:val="TableContents"/>
+            </w:pPr>
+          </w:p>
+        </w:tc>
+      </w:tr>
+      <w:tr>
+        <w:tblPrEx>
+          <w:tblCellMar>
+            <w:top w:w="0" w:type="dxa"/>
+            <w:bottom w:w="0" w:type="dxa"/>
+          </w:tblCellMar>
+        </w:tblPrEx>
+        <w:tc>
+          <w:tcPr>
+            <w:tcW w:w="4320" w:type="dxa"/>
+            <w:tcBorders>
+              <w:left w:val="single" w:sz="2" w:space="0" w:color="000000"/>
+              <w:bottom w:val="single" w:sz="2" w:space="0" w:color="000000"/>
+            </w:tcBorders>
+            <w:shd w:val="clear" w:color="auto" w:fill="auto"/>
+            <w:tcMar>
+              <w:top w:w="55" w:type="dxa"/>
+              <w:left w:w="55" w:type="dxa"/>
+              <w:bottom w:w="55" w:type="dxa"/>
+              <w:right w:w="55" w:type="dxa"/>
+            </w:tcMar>
+          </w:tcPr>
+          <w:p>
+            <w:pPr>
+              <w:pStyle w:val="TableContents"/>
+            </w:pPr>
+            <w:r>
+              <w:t>The table has things in it</w:t>
+            </w:r>
+          </w:p>
+        </w:tc>
+        <w:tc>
+          <w:tcPr>
+            <w:tcW w:w="8640" w:type="dxa"/>
+            <w:tcBorders>
+              <w:left w:val="single" w:sz="2" w:space="0" w:color="000000"/>
+              <w:bottom w:val="single" w:sz="2" w:space="0" w:color="000000"/>
+              <w:right w:val="single" w:sz="2" w:space="0" w:color="000000"/>
+            </w:tcBorders>
+            <w:shd w:val="clear" w:color="auto" w:fill="auto"/>
+            <w:tcMar>
+              <w:top w:w="55" w:type="dxa"/>
+              <w:left w:w="55" w:type="dxa"/>
+              <w:bottom w:w="55" w:type="dxa"/>
+              <w:right w:w="55" w:type="dxa"/>
+            </w:tcMar>
+          </w:tcPr>
+          <w:p>
+            <w:pPr>
+              <w:pStyle w:val="TableContents"/>
+            </w:pPr>
+          </w:p>
+        </w:tc>
+      </w:tr>
+    </w:tbl>
+    <w:p>
+      <w:pPr>
+        <w:pStyle w:val="Default"/>
+      </w:pPr>
+    </w:p>
+    <w:p>
+      <w:pPr>
+        <w:pStyle w:val="Default"/>
+      </w:pPr>
+    </w:p>
+    <w:p>
+      <w:pPr>
+        <w:pStyle w:val="Default"/>
+      </w:pPr>
+      <w:r>
+        <w:t xml:space="preserve">Apache Tika: </w:t>
+      </w:r>
+      <w:hyperlink r:id="rId7">
+        <w:r>
+          <w:rPr>
+            <w:rStyle w:val="InternetLink"/>
+          </w:rPr>
+          <w:t>http://tika.apache.org/</w:t>
+        </w:r>
+      </w:hyperlink>
+      <w:r>
+        <w:t xml:space="preserve"> </w:t>
+      </w:r>
+      <w:hyperlink r:id="rId8">
+        <w:r>
+          <w:rPr>
+            <w:rStyle w:val="InternetLink"/>
+          </w:rPr>
+          <w:t>Tika</w:t>
+        </w:r>
+      </w:hyperlink>
+    </w:p>
+    <w:p>
+      <w:pPr>
+        <w:pStyle w:val="Default"/>
+      </w:pPr>
+      <w:r>
+        <w:t xml:space="preserve">Apache POI: </w:t>
+      </w:r>
+      <w:hyperlink r:id="rId9">
+        <w:r>
+          <w:rPr>
+            <w:rStyle w:val="InternetLink"/>
+          </w:rPr>
+          <w:t>http://poi.apache.org/</w:t>
+        </w:r>
+      </w:hyperlink>
+      <w:r>
+        <w:t xml:space="preserve"> </w:t>
+      </w:r>
+      <w:hyperlink r:id="rId10">
+        <w:r>
+          <w:rPr>
+            <w:rStyle w:val="InternetLink"/>
+          </w:rPr>
+          <w:t>POI</w:t>
+        </w:r>
+      </w:hyperlink>
+    </w:p>
+    <w:p>
+      <w:pPr>
+        <w:pStyle w:val="Default"/>
+      </w:pPr>
+    </w:p>
+    <w:p>
+      <w:pPr>
+        <w:pStyle w:val="Default"/>
+      </w:pPr>
+      <w:r>
+        <w:t>This paragraph is in the default text style</w:t>
+      </w:r>
+    </w:p>
+    <w:p>
+      <w:pPr>
+        <w:pStyle w:val="Default"/>
+      </w:pPr>
+    </w:p>
+    <w:p>
+      <w:pPr>
+        <w:pStyle w:val="Signature"/>
+      </w:pPr>
+      <w:r>
         <w:lastRenderedPageBreak/>
-        <w:t>This is page two</w:t>
-      </w:r>
-    </w:p>
-    <w:p>
-      <w:pPr>
-        <w:rPr>
-          <w:rFonts w:ascii="Arial Black" w:hAnsi="Arial Black"/>
-          <w:color w:val="548DD4" w:themeColor="text2" w:themeTint="99"/>
-          <w:sz w:val="32"/>
-          <w:szCs w:val="32"/>
-        </w:rPr>
-      </w:pPr>
-      <w:r>
-        <w:rPr>
-          <w:rFonts w:ascii="Arial Black" w:hAnsi="Arial Black"/>
-          <w:color w:val="548DD4" w:themeColor="text2" w:themeTint="99"/>
-          <w:sz w:val="32"/>
-          <w:szCs w:val="32"/>
-        </w:rPr>
-        <w:t>It’s Arial Black in 16 point</w:t>
-      </w:r>
-    </w:p>
-    <w:p>
-      <w:pPr>
-        <w:rPr>
-          <w:rFonts w:ascii="Arial Black" w:hAnsi="Arial Black"/>
-          <w:color w:val="548DD4" w:themeColor="text2" w:themeTint="99"/>
-          <w:sz w:val="32"/>
-          <w:szCs w:val="32"/>
-        </w:rPr>
-      </w:pPr>
-      <w:r>
-        <w:rPr>
-          <w:rFonts w:ascii="Arial Black" w:hAnsi="Arial Black"/>
-          <w:color w:val="548DD4" w:themeColor="text2" w:themeTint="99"/>
-          <w:sz w:val="32"/>
-          <w:szCs w:val="32"/>
-        </w:rPr>
-        <w:t>It’s also in blue</w:t>
+        <w:t>This one is in a different one, the Signature style</w:t>
+      </w:r>
+    </w:p>
+    <w:p>
+      <w:pPr>
+        <w:pStyle w:val="Default"/>
+      </w:pPr>
+    </w:p>
+    <w:p>
+      <w:pPr>
+        <w:pStyle w:val="Default"/>
+      </w:pPr>
+      <w:r>
+        <w:t>This is back to the default again</w:t>
+      </w:r>
+    </w:p>
+    <w:p>
+      <w:pPr>
+        <w:pStyle w:val="Default"/>
+      </w:pPr>
+      <w:r>
+        <w:t xml:space="preserve">This links to </w:t>
+      </w:r>
+      <w:hyperlink w:anchor="OnMainHeading" w:history="1">
+        <w:r>
+          <w:rPr>
+            <w:rStyle w:val="Hyperlink"/>
+          </w:rPr>
+          <w:t>The Main Heading Bookmark</w:t>
+        </w:r>
+      </w:hyperlink>
+      <w:r>
+        <w:t xml:space="preserve"> and </w:t>
+      </w:r>
+      <w:hyperlink w:anchor="OnLevel3" w:history="1">
+        <w:r>
+          <w:rPr>
+            <w:rStyle w:val="Hyperlink"/>
+          </w:rPr>
+          <w:t>The Level 3 Bookmark</w:t>
+        </w:r>
+      </w:hyperlink>
+      <w:r>
+        <w:t>. That’s it!</w:t>
       </w:r>
     </w:p>
     <w:sectPr>
-      <w:pgSz w:w="11907" w:h="16840" w:code="9"/>
-      <w:pgMar w:top="1440" w:right="1440" w:bottom="1440" w:left="1440" w:header="709" w:footer="709" w:gutter="0"/>
-      <w:cols w:space="708"/>
-      <w:docGrid w:linePitch="360"/>
+      <w:headerReference w:type="default" r:id="rId11"/>
+      <w:footerReference w:type="default" r:id="rId12"/>
+      <w:pgSz w:w="12240" w:h="15840"/>
+      <w:pgMar w:top="1440" w:right="1440" w:bottom="1440" w:left="1440" w:header="720" w:footer="720" w:gutter="0"/>
+      <w:cols w:space="720"/>
+      <w:formProt w:val="0"/>
     </w:sectPr>
   </w:body>
 </w:document>
+</file>
+
+<file path=word/endnotes.xml><?xml version="1.0" encoding="utf-8"?>
+<w:endnotes xmlns:ve="http://schemas.openxmlformats.org/markup-compatibility/2006" xmlns:o="urn:schemas-microsoft-com:office:office" xmlns:r="http://schemas.openxmlformats.org/officeDocument/2006/relationships" xmlns:m="http://schemas.openxmlformats.org/officeDocument/2006/math" xmlns:v="urn:schemas-microsoft-com:vml" xmlns:wp="http://schemas.openxmlformats.org/drawingml/2006/wordprocessingDrawing" xmlns:w10="urn:schemas-microsoft-com:office:word" xmlns:w="http://schemas.openxmlformats.org/wordprocessingml/2006/main" xmlns:wne="http://schemas.microsoft.com/office/word/2006/wordml">
+  <w:endnote w:type="separator" w:id="-1">
+    <w:p>
+      <w:pPr>
+        <w:spacing w:after="0" w:line="240" w:lineRule="auto"/>
+      </w:pPr>
+      <w:r>
+        <w:separator/>
+      </w:r>
+    </w:p>
+  </w:endnote>
+  <w:endnote w:type="continuationSeparator" w:id="0">
+    <w:p>
+      <w:pPr>
+        <w:spacing w:after="0" w:line="240" w:lineRule="auto"/>
+      </w:pPr>
+      <w:r>
+        <w:continuationSeparator/>
+      </w:r>
+    </w:p>
+  </w:endnote>
+</w:endnotes>
+</file>
+
+<file path=word/footer1.xml><?xml version="1.0" encoding="utf-8"?>
+<w:ftr xmlns:ve="http://schemas.openxmlformats.org/markup-compatibility/2006" xmlns:o="urn:schemas-microsoft-com:office:office" xmlns:r="http://schemas.openxmlformats.org/officeDocument/2006/relationships" xmlns:m="http://schemas.openxmlformats.org/officeDocument/2006/math" xmlns:v="urn:schemas-microsoft-com:vml" xmlns:wp="http://schemas.openxmlformats.org/drawingml/2006/wordprocessingDrawing" xmlns:w10="urn:schemas-microsoft-com:office:word" xmlns:w="http://schemas.openxmlformats.org/wordprocessingml/2006/main" xmlns:wne="http://schemas.microsoft.com/office/word/2006/wordml">
+  <w:p>
+    <w:pPr>
+      <w:pStyle w:val="Footer"/>
+      <w:jc w:val="right"/>
+    </w:pPr>
+    <w:r>
+      <w:t>This is the footer for our document</w:t>
+    </w:r>
+  </w:p>
+</w:ftr>
+</file>
+
+<file path=word/footnotes.xml><?xml version="1.0" encoding="utf-8"?>
+<w:footnotes xmlns:ve="http://schemas.openxmlformats.org/markup-compatibility/2006" xmlns:o="urn:schemas-microsoft-com:office:office" xmlns:r="http://schemas.openxmlformats.org/officeDocument/2006/relationships" xmlns:m="http://schemas.openxmlformats.org/officeDocument/2006/math" xmlns:v="urn:schemas-microsoft-com:vml" xmlns:wp="http://schemas.openxmlformats.org/drawingml/2006/wordprocessingDrawing" xmlns:w10="urn:schemas-microsoft-com:office:word" xmlns:w="http://schemas.openxmlformats.org/wordprocessingml/2006/main" xmlns:wne="http://schemas.microsoft.com/office/word/2006/wordml">
+  <w:footnote w:type="separator" w:id="-1">
+    <w:p>
+      <w:pPr>
+        <w:spacing w:after="0" w:line="240" w:lineRule="auto"/>
+      </w:pPr>
+      <w:r>
+        <w:separator/>
+      </w:r>
+    </w:p>
+  </w:footnote>
+  <w:footnote w:type="continuationSeparator" w:id="0">
+    <w:p>
+      <w:pPr>
+        <w:spacing w:after="0" w:line="240" w:lineRule="auto"/>
+      </w:pPr>
+      <w:r>
+        <w:continuationSeparator/>
+      </w:r>
+    </w:p>
+  </w:footnote>
+</w:footnotes>
+</file>
+
+<file path=word/header1.xml><?xml version="1.0" encoding="utf-8"?>
+<w:hdr xmlns:ve="http://schemas.openxmlformats.org/markup-compatibility/2006" xmlns:o="urn:schemas-microsoft-com:office:office" xmlns:r="http://schemas.openxmlformats.org/officeDocument/2006/relationships" xmlns:m="http://schemas.openxmlformats.org/officeDocument/2006/math" xmlns:v="urn:schemas-microsoft-com:vml" xmlns:wp="http://schemas.openxmlformats.org/drawingml/2006/wordprocessingDrawing" xmlns:w10="urn:schemas-microsoft-com:office:word" xmlns:w="http://schemas.openxmlformats.org/wordprocessingml/2006/main" xmlns:wne="http://schemas.microsoft.com/office/word/2006/wordml">
+  <w:p>
+    <w:pPr>
+      <w:pStyle w:val="Header"/>
+      <w:jc w:val="center"/>
+    </w:pPr>
+    <w:r>
+      <w:t xml:space="preserve">This is the </w:t>
+    </w:r>
+    <w:r>
+      <w:t>header for our document</w:t>
+    </w:r>
+  </w:p>
+</w:hdr>
+</file>
+
+<file path=word/numbering.xml><?xml version="1.0" encoding="utf-8"?>
+<w:numbering xmlns:ve="http://schemas.openxmlformats.org/markup-compatibility/2006" xmlns:o="urn:schemas-microsoft-com:office:office" xmlns:r="http://schemas.openxmlformats.org/officeDocument/2006/relationships" xmlns:m="http://schemas.openxmlformats.org/officeDocument/2006/math" xmlns:v="urn:schemas-microsoft-com:vml" xmlns:wp="http://schemas.openxmlformats.org/drawingml/2006/wordprocessingDrawing" xmlns:w10="urn:schemas-microsoft-com:office:word" xmlns:w="http://schemas.openxmlformats.org/wordprocessingml/2006/main" xmlns:wne="http://schemas.microsoft.com/office/word/2006/wordml">
+  <w:abstractNum w:abstractNumId="0">
+    <w:nsid w:val="275B7BDF"/>
+    <w:multiLevelType w:val="multilevel"/>
+    <w:tmpl w:val="AF725B66"/>
+    <w:lvl w:ilvl="0">
+      <w:start w:val="1"/>
+      <w:numFmt w:val="none"/>
+      <w:pStyle w:val="Heading1"/>
+      <w:suff w:val="nothing"/>
+      <w:lvlText w:val=""/>
+      <w:lvlJc w:val="left"/>
+      <w:pPr>
+        <w:ind w:left="432" w:hanging="432"/>
+      </w:pPr>
+    </w:lvl>
+    <w:lvl w:ilvl="1">
+      <w:start w:val="1"/>
+      <w:numFmt w:val="none"/>
+      <w:pStyle w:val="Heading2"/>
+      <w:suff w:val="nothing"/>
+      <w:lvlText w:val=""/>
+      <w:lvlJc w:val="left"/>
+      <w:pPr>
+        <w:ind w:left="576" w:hanging="576"/>
+      </w:pPr>
+    </w:lvl>
+    <w:lvl w:ilvl="2">
+      <w:start w:val="1"/>
+      <w:numFmt w:val="none"/>
+      <w:pStyle w:val="Heading3"/>
+      <w:suff w:val="nothing"/>
+      <w:lvlText w:val=""/>
+      <w:lvlJc w:val="left"/>
+      <w:pPr>
+        <w:ind w:left="720" w:hanging="720"/>
+      </w:pPr>
+    </w:lvl>
+    <w:lvl w:ilvl="3">
+      <w:start w:val="1"/>
+      <w:numFmt w:val="none"/>
+      <w:suff w:val="nothing"/>
+      <w:lvlText w:val=""/>
+      <w:lvlJc w:val="left"/>
+      <w:pPr>
+        <w:ind w:left="864" w:hanging="864"/>
+      </w:pPr>
+    </w:lvl>
+    <w:lvl w:ilvl="4">
+      <w:start w:val="1"/>
+      <w:numFmt w:val="none"/>
+      <w:suff w:val="nothing"/>
+      <w:lvlText w:val=""/>
+      <w:lvlJc w:val="left"/>
+      <w:pPr>
+        <w:ind w:left="1008" w:hanging="1008"/>
+      </w:pPr>
+    </w:lvl>
+    <w:lvl w:ilvl="5">
+      <w:start w:val="1"/>
+      <w:numFmt w:val="none"/>
+      <w:suff w:val="nothing"/>
+      <w:lvlText w:val=""/>
+      <w:lvlJc w:val="left"/>
+      <w:pPr>
+        <w:ind w:left="1152" w:hanging="1152"/>
+      </w:pPr>
+    </w:lvl>
+    <w:lvl w:ilvl="6">
+      <w:start w:val="1"/>
+      <w:numFmt w:val="none"/>
+      <w:suff w:val="nothing"/>
+      <w:lvlText w:val=""/>
+      <w:lvlJc w:val="left"/>
+      <w:pPr>
+        <w:ind w:left="1296" w:hanging="1296"/>
+      </w:pPr>
+    </w:lvl>
+    <w:lvl w:ilvl="7">
+      <w:start w:val="1"/>
+      <w:numFmt w:val="none"/>
+      <w:suff w:val="nothing"/>
+      <w:lvlText w:val=""/>
+      <w:lvlJc w:val="left"/>
+      <w:pPr>
+        <w:ind w:left="1440" w:hanging="1440"/>
+      </w:pPr>
+    </w:lvl>
+    <w:lvl w:ilvl="8">
+      <w:start w:val="1"/>
+      <w:numFmt w:val="none"/>
+      <w:suff w:val="nothing"/>
+      <w:lvlText w:val=""/>
+      <w:lvlJc w:val="left"/>
+      <w:pPr>
+        <w:ind w:left="1584" w:hanging="1584"/>
+      </w:pPr>
+    </w:lvl>
+  </w:abstractNum>
+  <w:num w:numId="1">
+    <w:abstractNumId w:val="0"/>
+  </w:num>
+</w:numbering>
 </file>
 
 <file path=word/styles.xml><?xml version="1.0" encoding="utf-8"?>
@@ -95,7 +756,7 @@
   <w:docDefaults>
     <w:rPrDefault>
       <w:rPr>
-        <w:rFonts w:asciiTheme="minorHAnsi" w:eastAsiaTheme="minorHAnsi" w:hAnsiTheme="minorHAnsi" w:cstheme="minorBidi"/>
+        <w:rFonts w:asciiTheme="minorHAnsi" w:eastAsiaTheme="minorEastAsia" w:hAnsiTheme="minorHAnsi" w:cstheme="minorBidi"/>
         <w:sz w:val="22"/>
         <w:szCs w:val="22"/>
         <w:lang w:val="en-US" w:eastAsia="en-US" w:bidi="ar-SA"/>
@@ -250,6 +911,60 @@
     <w:name w:val="Normal"/>
     <w:qFormat/>
   </w:style>
+  <w:style w:type="paragraph" w:styleId="Heading1">
+    <w:name w:val="heading 1"/>
+    <w:basedOn w:val="Heading"/>
+    <w:next w:val="Textbody"/>
+    <w:rsid w:val="00693A70"/>
+    <w:pPr>
+      <w:numPr>
+        <w:numId w:val="1"/>
+      </w:numPr>
+      <w:outlineLvl w:val="0"/>
+    </w:pPr>
+    <w:rPr>
+      <w:b/>
+      <w:bCs/>
+      <w:sz w:val="32"/>
+      <w:szCs w:val="32"/>
+    </w:rPr>
+  </w:style>
+  <w:style w:type="paragraph" w:styleId="Heading2">
+    <w:name w:val="heading 2"/>
+    <w:basedOn w:val="Heading"/>
+    <w:next w:val="Textbody"/>
+    <w:rsid w:val="00693A70"/>
+    <w:pPr>
+      <w:numPr>
+        <w:ilvl w:val="1"/>
+        <w:numId w:val="1"/>
+      </w:numPr>
+      <w:outlineLvl w:val="1"/>
+    </w:pPr>
+    <w:rPr>
+      <w:b/>
+      <w:bCs/>
+      <w:i/>
+      <w:iCs/>
+    </w:rPr>
+  </w:style>
+  <w:style w:type="paragraph" w:styleId="Heading3">
+    <w:name w:val="heading 3"/>
+    <w:basedOn w:val="Heading"/>
+    <w:next w:val="Textbody"/>
+    <w:rsid w:val="00693A70"/>
+    <w:pPr>
+      <w:numPr>
+        <w:ilvl w:val="2"/>
+        <w:numId w:val="1"/>
+      </w:numPr>
+      <w:outlineLvl w:val="2"/>
+    </w:pPr>
+    <w:rPr>
+      <w:b/>
+      <w:bCs/>
+    </w:rPr>
+  </w:style>
   <w:style w:type="character" w:default="1" w:styleId="DefaultParagraphFont">
     <w:name w:val="Default Paragraph Font"/>
     <w:uiPriority w:val="1"/>
@@ -277,6 +992,165 @@
     <w:uiPriority w:val="99"/>
     <w:semiHidden/>
     <w:unhideWhenUsed/>
+  </w:style>
+  <w:style w:type="paragraph" w:customStyle="1" w:styleId="Default">
+    <w:name w:val="Default"/>
+    <w:rsid w:val="00693A70"/>
+    <w:pPr>
+      <w:tabs>
+        <w:tab w:val="left" w:pos="709"/>
+      </w:tabs>
+      <w:suppressAutoHyphens/>
+    </w:pPr>
+    <w:rPr>
+      <w:rFonts w:ascii="Times" w:eastAsia="Times" w:hAnsi="Times" w:cs="Times New Roman"/>
+      <w:sz w:val="24"/>
+      <w:szCs w:val="20"/>
+    </w:rPr>
+  </w:style>
+  <w:style w:type="character" w:customStyle="1" w:styleId="InternetLink">
+    <w:name w:val="Internet Link"/>
+    <w:rsid w:val="00693A70"/>
+    <w:rPr>
+      <w:color w:val="000080"/>
+      <w:u w:val="single"/>
+      <w:lang w:val="en-GB" w:eastAsia="en-GB" w:bidi="en-GB"/>
+    </w:rPr>
+  </w:style>
+  <w:style w:type="paragraph" w:customStyle="1" w:styleId="Heading">
+    <w:name w:val="Heading"/>
+    <w:basedOn w:val="Default"/>
+    <w:next w:val="Textbody"/>
+    <w:rsid w:val="00693A70"/>
+    <w:pPr>
+      <w:keepNext/>
+      <w:spacing w:before="240" w:after="120"/>
+    </w:pPr>
+    <w:rPr>
+      <w:rFonts w:ascii="Arial" w:eastAsia="DejaVu Sans" w:hAnsi="Arial" w:cs="DejaVu Sans"/>
+      <w:sz w:val="28"/>
+      <w:szCs w:val="28"/>
+    </w:rPr>
+  </w:style>
+  <w:style w:type="paragraph" w:customStyle="1" w:styleId="Textbody">
+    <w:name w:val="Text body"/>
+    <w:basedOn w:val="Default"/>
+    <w:rsid w:val="00693A70"/>
+    <w:pPr>
+      <w:spacing w:after="120"/>
+    </w:pPr>
+  </w:style>
+  <w:style w:type="paragraph" w:styleId="List">
+    <w:name w:val="List"/>
+    <w:basedOn w:val="Textbody"/>
+    <w:rsid w:val="00693A70"/>
+  </w:style>
+  <w:style w:type="paragraph" w:styleId="Caption">
+    <w:name w:val="caption"/>
+    <w:basedOn w:val="Default"/>
+    <w:rsid w:val="00693A70"/>
+    <w:pPr>
+      <w:suppressLineNumbers/>
+      <w:spacing w:before="120" w:after="120"/>
+    </w:pPr>
+    <w:rPr>
+      <w:i/>
+      <w:iCs/>
+      <w:szCs w:val="24"/>
+    </w:rPr>
+  </w:style>
+  <w:style w:type="paragraph" w:customStyle="1" w:styleId="Index">
+    <w:name w:val="Index"/>
+    <w:basedOn w:val="Default"/>
+    <w:rsid w:val="00693A70"/>
+    <w:pPr>
+      <w:suppressLineNumbers/>
+    </w:pPr>
+  </w:style>
+  <w:style w:type="paragraph" w:styleId="Title">
+    <w:name w:val="Title"/>
+    <w:basedOn w:val="Default"/>
+    <w:next w:val="Subtitle"/>
+    <w:rsid w:val="00693A70"/>
+    <w:pPr>
+      <w:jc w:val="center"/>
+    </w:pPr>
+    <w:rPr>
+      <w:b/>
+      <w:bCs/>
+      <w:sz w:val="36"/>
+      <w:szCs w:val="36"/>
+      <w:u w:val="single"/>
+    </w:rPr>
+  </w:style>
+  <w:style w:type="paragraph" w:styleId="Subtitle">
+    <w:name w:val="Subtitle"/>
+    <w:basedOn w:val="Heading"/>
+    <w:next w:val="Textbody"/>
+    <w:rsid w:val="00693A70"/>
+    <w:pPr>
+      <w:jc w:val="center"/>
+    </w:pPr>
+    <w:rPr>
+      <w:i/>
+      <w:iCs/>
+    </w:rPr>
+  </w:style>
+  <w:style w:type="paragraph" w:customStyle="1" w:styleId="TableContents">
+    <w:name w:val="Table Contents"/>
+    <w:basedOn w:val="Default"/>
+    <w:rsid w:val="00693A70"/>
+    <w:pPr>
+      <w:suppressLineNumbers/>
+    </w:pPr>
+  </w:style>
+  <w:style w:type="paragraph" w:styleId="Signature">
+    <w:name w:val="Signature"/>
+    <w:basedOn w:val="Default"/>
+    <w:rsid w:val="00693A70"/>
+    <w:pPr>
+      <w:suppressLineNumbers/>
+      <w:ind w:left="113" w:right="113"/>
+    </w:pPr>
+    <w:rPr>
+      <w:rFonts w:ascii="Georgia" w:hAnsi="Georgia"/>
+      <w:color w:val="008000"/>
+    </w:rPr>
+  </w:style>
+  <w:style w:type="paragraph" w:styleId="Header">
+    <w:name w:val="header"/>
+    <w:basedOn w:val="Default"/>
+    <w:rsid w:val="00693A70"/>
+    <w:pPr>
+      <w:suppressLineNumbers/>
+      <w:tabs>
+        <w:tab w:val="center" w:pos="4320"/>
+        <w:tab w:val="right" w:pos="8640"/>
+      </w:tabs>
+    </w:pPr>
+  </w:style>
+  <w:style w:type="paragraph" w:styleId="Footer">
+    <w:name w:val="footer"/>
+    <w:basedOn w:val="Default"/>
+    <w:rsid w:val="00693A70"/>
+    <w:pPr>
+      <w:suppressLineNumbers/>
+      <w:tabs>
+        <w:tab w:val="center" w:pos="4320"/>
+        <w:tab w:val="right" w:pos="8640"/>
+      </w:tabs>
+    </w:pPr>
+  </w:style>
+  <w:style w:type="character" w:styleId="Hyperlink">
+    <w:name w:val="Hyperlink"/>
+    <w:basedOn w:val="DefaultParagraphFont"/>
+    <w:uiPriority w:val="99"/>
+    <w:unhideWhenUsed/>
+    <w:rsid w:val="00E46F9C"/>
+    <w:rPr>
+      <w:color w:val="0000FF" w:themeColor="hyperlink"/>
+      <w:u w:val="single"/>
+    </w:rPr>
   </w:style>
 </w:styles>
 </file>
@@ -562,16 +1436,4 @@
   <a:objectDefaults/>
   <a:extraClrSchemeLst/>
 </a:theme>
-</file>
-
-<file path=customXml/item1.xml><?xml version="1.0" encoding="utf-8"?>
-<b:Sources xmlns:b="http://schemas.openxmlformats.org/officeDocument/2006/bibliography" xmlns="http://schemas.openxmlformats.org/officeDocument/2006/bibliography" SelectedStyle="\APA.XSL" StyleName="APA"/>
-</file>
-
-<file path=customXml/itemProps1.xml><?xml version="1.0" encoding="utf-8"?>
-<ds:datastoreItem xmlns:ds="http://schemas.openxmlformats.org/officeDocument/2006/customXml" ds:itemID="{6C83F15D-F5C6-4B31-B59B-4A6D342E02D3}">
-  <ds:schemaRefs>
-    <ds:schemaRef ds:uri="http://schemas.openxmlformats.org/officeDocument/2006/bibliography"/>
-  </ds:schemaRefs>
-</ds:datastoreItem>
 </file>
</xml_diff>